<commit_message>
Systemanalyse Hub-Architektur: Diagramme fuer DOCX/PDF gekuerzt, Fassungen neu erzeugt
</commit_message>
<xml_diff>
--- a/docs/konzepte/260911-Systemanalyse-Hub-Architektur-NAS-Git/260911-Systemanalyse-Hub-Architektur-NAS-Git.docx
+++ b/docs/konzepte/260911-Systemanalyse-Hub-Architektur-NAS-Git/260911-Systemanalyse-Hub-Architektur-NAS-Git.docx
@@ -189,25 +189,25 @@
           <w:rFonts w:ascii="Consolas" w:hAnsi="Consolas"/>
           <w:sz w:val="18"/>
         </w:rPr>
-        <w:t xml:space="preserve">                 GitHub (Backup, zwei Schreiber auf main)</w:t>
+        <w:t xml:space="preserve">            GitHub (Backup, zwei Schreiber auf main)</w:t>
         <w:br/>
-        <w:t xml:space="preserve">                    ▲                       ▲</w:t>
+        <w:t xml:space="preserve">               ▲                    ▲</w:t>
         <w:br/>
-        <w:t xml:space="preserve">      nas-selfcommit│15 Min      git-auto-sync│5 Min je Station</w:t>
+        <w:t xml:space="preserve"> nas-selfcommit│15 Min   git-auto-sync│5 Min je Station</w:t>
         <w:br/>
-        <w:t xml:space="preserve">                    │                       │</w:t>
+        <w:t xml:space="preserve">               │                    │</w:t>
         <w:br/>
-        <w:t xml:space="preserve">   NAS DS918+ ──────┴── SMB ──▶ Mac Mini ───┴──▶ SSD-Klon (Lesespiegel, faktisch beschrieben)</w:t>
+        <w:t xml:space="preserve"> NAS DS918+ ───┴─ SMB ─▶ Mac Mini ──┴─▶ SSD-Klon (faktisch beschrieben)</w:t>
         <w:br/>
-        <w:t xml:space="preserve">   /volume2/daten          ──▶ MacBook Pro M2  ──▶ SSD-Klon</w:t>
+        <w:t xml:space="preserve"> /volume2/daten       ─▶ MacBook M2   ─▶ SSD-Klon</w:t>
         <w:br/>
-        <w:t xml:space="preserve">   jans-ai-hub (KANONISCH) ──▶ MacBook Revendo ──▶ SSD-Klon</w:t>
+        <w:t xml:space="preserve"> (KANONISCH)          ─▶ MacBook Rev. ─▶ SSD-Klon</w:t>
         <w:br/>
-        <w:t xml:space="preserve">        ▲                        │</w:t>
+        <w:t xml:space="preserve">      ▲                    │ nas-auto-mount 180 s</w:t>
         <w:br/>
-        <w:t xml:space="preserve">        │ Symlinks .claude/*     │ nas-auto-mount 180 s · nas-keepalive 60 s</w:t>
+        <w:t xml:space="preserve">      │ Symlinks .claude/* │ nas-keepalive 60 s</w:t>
         <w:br/>
-        <w:t xml:space="preserve">        └────────────────────────┘ ensure-nas-mounted vor jedem Lauf</w:t>
+        <w:t xml:space="preserve">      └────────────────────┘ ensure-nas-mounted je Lauf</w:t>
       </w:r>
     </w:p>
     <w:p>
@@ -1862,29 +1862,31 @@
           <w:rFonts w:ascii="Consolas" w:hAnsi="Consolas"/>
           <w:sz w:val="18"/>
         </w:rPr>
-        <w:t xml:space="preserve">                        GitHub  origin/main  (EINZIGE QUELLE, Off-Site)</w:t>
+        <w:t xml:space="preserve">           GitHub origin/main (EINZIGE QUELLE, Off-Site)</w:t>
         <w:br/>
-        <w:t xml:space="preserve">                       ▲        ▲          ▲</w:t>
+        <w:t xml:space="preserve">             ▲              ▲              ▲</w:t>
         <w:br/>
-        <w:t xml:space="preserve">                  push │        │          │ pull --rebase, push</w:t>
+        <w:t xml:space="preserve">        push │              │              │ pull --rebase, push</w:t>
         <w:br/>
-        <w:t xml:space="preserve">                       │        │          │</w:t>
+        <w:t xml:space="preserve">             │              │              │</w:t>
         <w:br/>
-        <w:t xml:space="preserve">   Mac Mini (ZENTRALE) │   MacBook Pro M2  │   MacBook Revendo</w:t>
+        <w:t xml:space="preserve"> Mac Mini (ZENTRALE)   MacBook Pro M2   MacBook Revendo</w:t>
         <w:br/>
-        <w:t xml:space="preserve">   Klon + alle Loops   │   Klon, mobil,    │   Klon, Lern-Betrieb</w:t>
+        <w:t xml:space="preserve"> Klon + alle Loops     Klon, mobil,     Klon, Lern-Betrieb</w:t>
         <w:br/>
-        <w:t xml:space="preserve">   Aufsicht, Queue,    │   offline fähig   │</w:t>
+        <w:t xml:space="preserve"> Aufsicht, Queue,      offline fähig</w:t>
         <w:br/>
-        <w:t xml:space="preserve">   Dispatch-Endpunkt   │                   │</w:t>
+        <w:t xml:space="preserve"> Dispatch-Endpunkt</w:t>
         <w:br/>
-        <w:t xml:space="preserve">        │ liest Rohkorpora (Archiv, Bauprodukte, Synobsis) nur bei Bedarf</w:t>
+        <w:t xml:space="preserve">      │ liest Rohkorpora nur bei Bedarf</w:t>
         <w:br/>
-        <w:t xml:space="preserve">        ▼</w:t>
+        <w:t xml:space="preserve">      ▼</w:t>
         <w:br/>
-        <w:t xml:space="preserve">   NAS DS918+  =  Dateiserver für Archiv, Rohkorpora, schwere Referenzen, Backup-Spiegel</w:t>
+        <w:t xml:space="preserve"> NAS DS918+ = Dateiserver: Archiv, Rohkorpora, schwere</w:t>
         <w:br/>
-        <w:t xml:space="preserve">                  (kein Git-Arbeitsbaum, kein Committer, keine Symlinks mehr dorthin)</w:t>
+        <w:t xml:space="preserve"> Referenzen, Backup-Spiegel (kein Git-Arbeitsbaum,</w:t>
+        <w:br/>
+        <w:t xml:space="preserve"> kein Committer, keine Symlinks mehr dorthin)</w:t>
       </w:r>
     </w:p>
     <w:p>

</xml_diff>

<commit_message>
Korrektur 11.09. 15:0x: Hauptarbeitsgeraet ist der Mac Mini (gemessen), Empfehlung zuerst V0+, V2 nach Messung; Nachtraege in Systemanalyse, Vertiefung, Fristen
</commit_message>
<xml_diff>
--- a/docs/konzepte/260911-Systemanalyse-Hub-Architektur-NAS-Git/260911-Systemanalyse-Hub-Architektur-NAS-Git.docx
+++ b/docs/konzepte/260911-Systemanalyse-Hub-Architektur-NAS-Git/260911-Systemanalyse-Hub-Architektur-NAS-Git.docx
@@ -20,6 +20,27 @@
           <w:sz w:val="20"/>
         </w:rPr>
         <w:t>docs/konzepte/260911-Systemanalyse-Hub-Architektur-NAS-Git/</w:t>
+      </w:r>
+    </w:p>
+    <w:p>
+      <w:r>
+        <w:rPr>
+          <w:b/>
+        </w:rPr>
+        <w:t>Nachtrag 11.09.2026, 15:0x:</w:t>
+      </w:r>
+      <w:r>
+        <w:t xml:space="preserve"> Die Vertiefung </w:t>
+      </w:r>
+      <w:r>
+        <w:rPr>
+          <w:rFonts w:ascii="Consolas" w:hAnsi="Consolas"/>
+          <w:sz w:val="20"/>
+        </w:rPr>
+        <w:t>docs/konzepte/260911-Vertiefung-Umbau-Verifikation-Routinen/</w:t>
+      </w:r>
+      <w:r>
+        <w:t xml:space="preserve"> korrigiert die Gewichtung: Raphael arbeitet auf dem Mac Mini (494 interaktive Sessions in 30 Tagen gegen 142), das MacBook Pro trägt die Routinen. Empfehlung seither: zuerst V0+ (Routinen und Aufsicht auf den Mini, ein Schreiber), V2 nach vier Wochen Messung. Die Befunde dieses Dokuments bleiben gültig.</w:t>
       </w:r>
     </w:p>
     <w:p>

</xml_diff>